<commit_message>
Corregir evidencias del informe SQL
</commit_message>
<xml_diff>
--- a/Informe_Resultados_DB_SHOP.docx
+++ b/Informe_Resultados_DB_SHOP.docx
@@ -35,7 +35,7 @@
       <w:r>
         <w:drawing>
           <wp:inline xmlns:a="http://schemas.openxmlformats.org/drawingml/2006/main" xmlns:pic="http://schemas.openxmlformats.org/drawingml/2006/picture">
-            <wp:extent cx="6217920" cy="5554675"/>
+            <wp:extent cx="6217920" cy="6201339"/>
             <wp:docPr id="1" name="Picture 1"/>
             <wp:cNvGraphicFramePr>
               <a:graphicFrameLocks noChangeAspect="1"/>
@@ -56,7 +56,7 @@
                   <pic:spPr>
                     <a:xfrm>
                       <a:off x="0" y="0"/>
-                      <a:ext cx="6217920" cy="5554675"/>
+                      <a:ext cx="6217920" cy="6201339"/>
                     </a:xfrm>
                     <a:prstGeom prst="rect"/>
                   </pic:spPr>
@@ -104,7 +104,7 @@
       <w:r>
         <w:drawing>
           <wp:inline xmlns:a="http://schemas.openxmlformats.org/drawingml/2006/main" xmlns:pic="http://schemas.openxmlformats.org/drawingml/2006/picture">
-            <wp:extent cx="6217920" cy="5770230"/>
+            <wp:extent cx="6217920" cy="5123566"/>
             <wp:docPr id="2" name="Picture 2"/>
             <wp:cNvGraphicFramePr>
               <a:graphicFrameLocks noChangeAspect="1"/>
@@ -125,7 +125,7 @@
                   <pic:spPr>
                     <a:xfrm>
                       <a:off x="0" y="0"/>
-                      <a:ext cx="6217920" cy="5770230"/>
+                      <a:ext cx="6217920" cy="5123566"/>
                     </a:xfrm>
                     <a:prstGeom prst="rect"/>
                   </pic:spPr>
@@ -173,7 +173,7 @@
       <w:r>
         <w:drawing>
           <wp:inline xmlns:a="http://schemas.openxmlformats.org/drawingml/2006/main" xmlns:pic="http://schemas.openxmlformats.org/drawingml/2006/picture">
-            <wp:extent cx="6217920" cy="4153571"/>
+            <wp:extent cx="6217920" cy="3399130"/>
             <wp:docPr id="3" name="Picture 3"/>
             <wp:cNvGraphicFramePr>
               <a:graphicFrameLocks noChangeAspect="1"/>
@@ -194,7 +194,7 @@
                   <pic:spPr>
                     <a:xfrm>
                       <a:off x="0" y="0"/>
-                      <a:ext cx="6217920" cy="4153571"/>
+                      <a:ext cx="6217920" cy="3399130"/>
                     </a:xfrm>
                     <a:prstGeom prst="rect"/>
                   </pic:spPr>
@@ -242,7 +242,7 @@
       <w:r>
         <w:drawing>
           <wp:inline xmlns:a="http://schemas.openxmlformats.org/drawingml/2006/main" xmlns:pic="http://schemas.openxmlformats.org/drawingml/2006/picture">
-            <wp:extent cx="6217920" cy="6955780"/>
+            <wp:extent cx="6217920" cy="3399130"/>
             <wp:docPr id="4" name="Picture 4"/>
             <wp:cNvGraphicFramePr>
               <a:graphicFrameLocks noChangeAspect="1"/>
@@ -263,7 +263,7 @@
                   <pic:spPr>
                     <a:xfrm>
                       <a:off x="0" y="0"/>
-                      <a:ext cx="6217920" cy="6955780"/>
+                      <a:ext cx="6217920" cy="3399130"/>
                     </a:xfrm>
                     <a:prstGeom prst="rect"/>
                   </pic:spPr>
@@ -311,7 +311,7 @@
       <w:r>
         <w:drawing>
           <wp:inline xmlns:a="http://schemas.openxmlformats.org/drawingml/2006/main" xmlns:pic="http://schemas.openxmlformats.org/drawingml/2006/picture">
-            <wp:extent cx="6217920" cy="5770230"/>
+            <wp:extent cx="6217920" cy="4908011"/>
             <wp:docPr id="5" name="Picture 5"/>
             <wp:cNvGraphicFramePr>
               <a:graphicFrameLocks noChangeAspect="1"/>
@@ -332,7 +332,7 @@
                   <pic:spPr>
                     <a:xfrm>
                       <a:off x="0" y="0"/>
-                      <a:ext cx="6217920" cy="5770230"/>
+                      <a:ext cx="6217920" cy="4908011"/>
                     </a:xfrm>
                     <a:prstGeom prst="rect"/>
                   </pic:spPr>
@@ -380,7 +380,7 @@
       <w:r>
         <w:drawing>
           <wp:inline xmlns:a="http://schemas.openxmlformats.org/drawingml/2006/main" xmlns:pic="http://schemas.openxmlformats.org/drawingml/2006/picture">
-            <wp:extent cx="6217920" cy="7279112"/>
+            <wp:extent cx="6217920" cy="4800234"/>
             <wp:docPr id="6" name="Picture 6"/>
             <wp:cNvGraphicFramePr>
               <a:graphicFrameLocks noChangeAspect="1"/>
@@ -401,7 +401,7 @@
                   <pic:spPr>
                     <a:xfrm>
                       <a:off x="0" y="0"/>
-                      <a:ext cx="6217920" cy="7279112"/>
+                      <a:ext cx="6217920" cy="4800234"/>
                     </a:xfrm>
                     <a:prstGeom prst="rect"/>
                   </pic:spPr>
@@ -449,7 +449,7 @@
       <w:r>
         <w:drawing>
           <wp:inline xmlns:a="http://schemas.openxmlformats.org/drawingml/2006/main" xmlns:pic="http://schemas.openxmlformats.org/drawingml/2006/picture">
-            <wp:extent cx="6217920" cy="2968020"/>
+            <wp:extent cx="6217920" cy="4800234"/>
             <wp:docPr id="7" name="Picture 7"/>
             <wp:cNvGraphicFramePr>
               <a:graphicFrameLocks noChangeAspect="1"/>
@@ -470,7 +470,7 @@
                   <pic:spPr>
                     <a:xfrm>
                       <a:off x="0" y="0"/>
-                      <a:ext cx="6217920" cy="2968020"/>
+                      <a:ext cx="6217920" cy="4800234"/>
                     </a:xfrm>
                     <a:prstGeom prst="rect"/>
                   </pic:spPr>
@@ -518,7 +518,7 @@
       <w:r>
         <w:drawing>
           <wp:inline xmlns:a="http://schemas.openxmlformats.org/drawingml/2006/main" xmlns:pic="http://schemas.openxmlformats.org/drawingml/2006/picture">
-            <wp:extent cx="6217920" cy="1077773"/>
+            <wp:extent cx="6217920" cy="4692457"/>
             <wp:docPr id="8" name="Picture 8"/>
             <wp:cNvGraphicFramePr>
               <a:graphicFrameLocks noChangeAspect="1"/>
@@ -539,7 +539,7 @@
                   <pic:spPr>
                     <a:xfrm>
                       <a:off x="0" y="0"/>
-                      <a:ext cx="6217920" cy="1077773"/>
+                      <a:ext cx="6217920" cy="4692457"/>
                     </a:xfrm>
                     <a:prstGeom prst="rect"/>
                   </pic:spPr>
@@ -587,7 +587,7 @@
       <w:r>
         <w:drawing>
           <wp:inline xmlns:a="http://schemas.openxmlformats.org/drawingml/2006/main" xmlns:pic="http://schemas.openxmlformats.org/drawingml/2006/picture">
-            <wp:extent cx="6217920" cy="1077773"/>
+            <wp:extent cx="6217920" cy="1459139"/>
             <wp:docPr id="9" name="Picture 9"/>
             <wp:cNvGraphicFramePr>
               <a:graphicFrameLocks noChangeAspect="1"/>
@@ -608,7 +608,7 @@
                   <pic:spPr>
                     <a:xfrm>
                       <a:off x="0" y="0"/>
-                      <a:ext cx="6217920" cy="1077773"/>
+                      <a:ext cx="6217920" cy="1459139"/>
                     </a:xfrm>
                     <a:prstGeom prst="rect"/>
                   </pic:spPr>
@@ -656,7 +656,7 @@
       <w:r>
         <w:drawing>
           <wp:inline xmlns:a="http://schemas.openxmlformats.org/drawingml/2006/main" xmlns:pic="http://schemas.openxmlformats.org/drawingml/2006/picture">
-            <wp:extent cx="6217920" cy="1077773"/>
+            <wp:extent cx="6217920" cy="2860243"/>
             <wp:docPr id="10" name="Picture 10"/>
             <wp:cNvGraphicFramePr>
               <a:graphicFrameLocks noChangeAspect="1"/>
@@ -677,7 +677,7 @@
                   <pic:spPr>
                     <a:xfrm>
                       <a:off x="0" y="0"/>
-                      <a:ext cx="6217920" cy="1077773"/>
+                      <a:ext cx="6217920" cy="2860243"/>
                     </a:xfrm>
                     <a:prstGeom prst="rect"/>
                   </pic:spPr>

</xml_diff>

<commit_message>
Incorporar captura real del panel SQL
</commit_message>
<xml_diff>
--- a/Informe_Resultados_DB_SHOP.docx
+++ b/Informe_Resultados_DB_SHOP.docx
@@ -700,6 +700,75 @@
         <w:t>Captura 10. Cierre del script y consultas de resultado.</w:t>
       </w:r>
     </w:p>
+    <w:p>
+      <w:r>
+        <w:br w:type="page"/>
+      </w:r>
+    </w:p>
+    <w:p>
+      <w:pPr>
+        <w:pStyle w:val="Heading1"/>
+      </w:pPr>
+      <w:r>
+        <w:t>Evidencia de ejecucion del panel web</w:t>
+      </w:r>
+    </w:p>
+    <w:p>
+      <w:r>
+        <w:t>El panel se levanto con Docker Compose en http://localhost:8091/panel_sql/. Permite consultar cada bloque, copiarlo para SQL Server Management Studio y descargar el script completo sin guardar credenciales.</w:t>
+      </w:r>
+    </w:p>
+    <w:p>
+      <w:pPr>
+        <w:jc w:val="center"/>
+      </w:pPr>
+      <w:r>
+        <w:drawing>
+          <wp:inline xmlns:a="http://schemas.openxmlformats.org/drawingml/2006/main" xmlns:pic="http://schemas.openxmlformats.org/drawingml/2006/picture">
+            <wp:extent cx="6217920" cy="4318000"/>
+            <wp:docPr id="11" name="Picture 11"/>
+            <wp:cNvGraphicFramePr>
+              <a:graphicFrameLocks noChangeAspect="1"/>
+            </wp:cNvGraphicFramePr>
+            <a:graphic>
+              <a:graphicData uri="http://schemas.openxmlformats.org/drawingml/2006/picture">
+                <pic:pic>
+                  <pic:nvPicPr>
+                    <pic:cNvPr id="0" name="11_panel_sql_funcionando.png"/>
+                    <pic:cNvPicPr/>
+                  </pic:nvPicPr>
+                  <pic:blipFill>
+                    <a:blip r:embed="rId20"/>
+                    <a:stretch>
+                      <a:fillRect/>
+                    </a:stretch>
+                  </pic:blipFill>
+                  <pic:spPr>
+                    <a:xfrm>
+                      <a:off x="0" y="0"/>
+                      <a:ext cx="6217920" cy="4318000"/>
+                    </a:xfrm>
+                    <a:prstGeom prst="rect"/>
+                  </pic:spPr>
+                </pic:pic>
+              </a:graphicData>
+            </a:graphic>
+          </wp:inline>
+        </w:drawing>
+      </w:r>
+    </w:p>
+    <w:p>
+      <w:pPr>
+        <w:jc w:val="center"/>
+      </w:pPr>
+      <w:r>
+        <w:rPr>
+          <w:i/>
+          <w:sz w:val="16"/>
+        </w:rPr>
+        <w:t>Captura 11. Panel web local de DB SHOP mostrando los seis bloques del deber.</w:t>
+      </w:r>
+    </w:p>
     <w:sectPr>
       <w:headerReference w:type="default" r:id="rId9"/>
       <w:pgSz w:w="12240" w:h="15840"/>

</xml_diff>

<commit_message>
Explicar Docker y estructura en informe
</commit_message>
<xml_diff>
--- a/Informe_Resultados_DB_SHOP.docx
+++ b/Informe_Resultados_DB_SHOP.docx
@@ -769,6 +769,250 @@
         <w:t>Captura 11. Panel web local de DB SHOP mostrando los seis bloques del deber.</w:t>
       </w:r>
     </w:p>
+    <w:p>
+      <w:r>
+        <w:br w:type="page"/>
+      </w:r>
+    </w:p>
+    <w:p>
+      <w:pPr>
+        <w:pStyle w:val="Heading1"/>
+      </w:pPr>
+      <w:r>
+        <w:t>Estructura y uso de Docker</w:t>
+      </w:r>
+    </w:p>
+    <w:p>
+      <w:r>
+        <w:t>La solución se concentra en un script T-SQL ordenado por los seis bloques solicitados. El panel web es una ayuda de navegación: permite revisar, copiar o descargar cada bloque sin mezclar la interfaz con la ejecución real de SQL Server.</w:t>
+      </w:r>
+    </w:p>
+    <w:p>
+      <w:pPr>
+        <w:pStyle w:val="ListBullet"/>
+      </w:pPr>
+      <w:r>
+        <w:t>Estudiante_Actividad3.sql: solución completa, organizada de Bloque 1 a Bloque 6.</w:t>
+      </w:r>
+    </w:p>
+    <w:p>
+      <w:pPr>
+        <w:pStyle w:val="ListBullet"/>
+      </w:pPr>
+      <w:r>
+        <w:t>pedidos_online.csv: fuente externa que alimenta la zona staging del ETL.</w:t>
+      </w:r>
+    </w:p>
+    <w:p>
+      <w:pPr>
+        <w:pStyle w:val="ListBullet"/>
+      </w:pPr>
+      <w:r>
+        <w:t>panel_sql: interfaz HTML, CSS y JavaScript que separa y presenta cada bloque del script.</w:t>
+      </w:r>
+    </w:p>
+    <w:p>
+      <w:pPr>
+        <w:pStyle w:val="ListBullet"/>
+      </w:pPr>
+      <w:r>
+        <w:t>docker-compose.yml: publica el panel con Nginx en un contenedor local.</w:t>
+      </w:r>
+    </w:p>
+    <w:p>
+      <w:pPr>
+        <w:pStyle w:val="ListBullet"/>
+      </w:pPr>
+      <w:r>
+        <w:t>evidencias: conserva las capturas usadas en este informe.</w:t>
+      </w:r>
+    </w:p>
+    <w:p>
+      <w:pPr>
+        <w:pStyle w:val="Heading1"/>
+      </w:pPr>
+      <w:r>
+        <w:t>Por qué se usa Docker</w:t>
+      </w:r>
+    </w:p>
+    <w:p>
+      <w:r>
+        <w:t>Docker permite mostrar el panel de apoyo con Nginx sin instalar ni configurar un servidor web en el equipo. El archivo docker-compose.yml fija el puerto y el contenido a publicar, por lo que cualquier equipo con Docker puede abrir el mismo panel en http://localhost:8091/panel_sql/. Esto es más confiable que abrir archivos HTML de forma aislada, porque conserva las rutas relativas al script SQL y al CSV. El panel no sustituye SQL Server: el T-SQL debe ejecutarse en SSMS contra la DB_SHOP de la Actividad 2.</w:t>
+      </w:r>
+    </w:p>
+    <w:p>
+      <w:pPr>
+        <w:pStyle w:val="Heading1"/>
+      </w:pPr>
+      <w:r>
+        <w:t>Archivos principales</w:t>
+      </w:r>
+    </w:p>
+    <w:tbl>
+      <w:tblPr>
+        <w:tblStyle w:val="TableGrid"/>
+        <w:tblW w:type="auto" w:w="0"/>
+        <w:tblLook w:firstColumn="1" w:firstRow="1" w:lastColumn="0" w:lastRow="0" w:noHBand="0" w:noVBand="1" w:val="04A0"/>
+      </w:tblPr>
+      <w:tblGrid>
+        <w:gridCol w:w="5040"/>
+        <w:gridCol w:w="5040"/>
+      </w:tblGrid>
+      <w:tr>
+        <w:tc>
+          <w:tcPr>
+            <w:tcW w:type="dxa" w:w="5040"/>
+          </w:tcPr>
+          <w:p>
+            <w:r>
+              <w:t>Archivo</w:t>
+            </w:r>
+          </w:p>
+        </w:tc>
+        <w:tc>
+          <w:tcPr>
+            <w:tcW w:type="dxa" w:w="5040"/>
+          </w:tcPr>
+          <w:p>
+            <w:r>
+              <w:t>Responsabilidad en la solución</w:t>
+            </w:r>
+          </w:p>
+        </w:tc>
+      </w:tr>
+      <w:tr>
+        <w:tc>
+          <w:tcPr>
+            <w:tcW w:type="dxa" w:w="5040"/>
+          </w:tcPr>
+          <w:p>
+            <w:r>
+              <w:t>Estudiante_Actividad3.sql</w:t>
+            </w:r>
+          </w:p>
+        </w:tc>
+        <w:tc>
+          <w:tcPr>
+            <w:tcW w:type="dxa" w:w="5040"/>
+          </w:tcPr>
+          <w:p>
+            <w:r>
+              <w:t>Resuelve el ejercicio: esquemas, integridad, roles, vistas, procedimientos, ETL y consultas de negocio.</w:t>
+            </w:r>
+          </w:p>
+        </w:tc>
+      </w:tr>
+      <w:tr>
+        <w:tc>
+          <w:tcPr>
+            <w:tcW w:type="dxa" w:w="5040"/>
+          </w:tcPr>
+          <w:p>
+            <w:r>
+              <w:t>panel_sql/index.html</w:t>
+            </w:r>
+          </w:p>
+        </w:tc>
+        <w:tc>
+          <w:tcPr>
+            <w:tcW w:type="dxa" w:w="5040"/>
+          </w:tcPr>
+          <w:p>
+            <w:r>
+              <w:t>Estructura visual del panel y las instrucciones de ejecución.</w:t>
+            </w:r>
+          </w:p>
+        </w:tc>
+      </w:tr>
+      <w:tr>
+        <w:tc>
+          <w:tcPr>
+            <w:tcW w:type="dxa" w:w="5040"/>
+          </w:tcPr>
+          <w:p>
+            <w:r>
+              <w:t>panel_sql/panel.js</w:t>
+            </w:r>
+          </w:p>
+        </w:tc>
+        <w:tc>
+          <w:tcPr>
+            <w:tcW w:type="dxa" w:w="5040"/>
+          </w:tcPr>
+          <w:p>
+            <w:r>
+              <w:t>Carga el script, separa los seis bloques y habilita copiado y revisión.</w:t>
+            </w:r>
+          </w:p>
+        </w:tc>
+      </w:tr>
+      <w:tr>
+        <w:tc>
+          <w:tcPr>
+            <w:tcW w:type="dxa" w:w="5040"/>
+          </w:tcPr>
+          <w:p>
+            <w:r>
+              <w:t>panel_sql/styles.css</w:t>
+            </w:r>
+          </w:p>
+        </w:tc>
+        <w:tc>
+          <w:tcPr>
+            <w:tcW w:type="dxa" w:w="5040"/>
+          </w:tcPr>
+          <w:p>
+            <w:r>
+              <w:t>Da formato legible a los bloques y controles del panel.</w:t>
+            </w:r>
+          </w:p>
+        </w:tc>
+      </w:tr>
+      <w:tr>
+        <w:tc>
+          <w:tcPr>
+            <w:tcW w:type="dxa" w:w="5040"/>
+          </w:tcPr>
+          <w:p>
+            <w:r>
+              <w:t>pedidos_online.csv</w:t>
+            </w:r>
+          </w:p>
+        </w:tc>
+        <w:tc>
+          <w:tcPr>
+            <w:tcW w:type="dxa" w:w="5040"/>
+          </w:tcPr>
+          <w:p>
+            <w:r>
+              <w:t>Aporta los pedidos web que el ETL limpia, valida y reconcilia.</w:t>
+            </w:r>
+          </w:p>
+        </w:tc>
+      </w:tr>
+      <w:tr>
+        <w:tc>
+          <w:tcPr>
+            <w:tcW w:type="dxa" w:w="5040"/>
+          </w:tcPr>
+          <w:p>
+            <w:r>
+              <w:t>docker-compose.yml</w:t>
+            </w:r>
+          </w:p>
+        </w:tc>
+        <w:tc>
+          <w:tcPr>
+            <w:tcW w:type="dxa" w:w="5040"/>
+          </w:tcPr>
+          <w:p>
+            <w:r>
+              <w:t>Define Nginx para servir el panel localmente.</w:t>
+            </w:r>
+          </w:p>
+        </w:tc>
+      </w:tr>
+    </w:tbl>
     <w:sectPr>
       <w:headerReference w:type="default" r:id="rId9"/>
       <w:pgSz w:w="12240" w:h="15840"/>

</xml_diff>